<commit_message>
Update 25 mar 2026
</commit_message>
<xml_diff>
--- a/CM0/LCD_MIPI_DSI_001.docx
+++ b/CM0/LCD_MIPI_DSI_001.docx
@@ -15,21 +15,12 @@
           <w:bCs/>
         </w:rPr>
       </w:pPr>
-      <w:proofErr w:type="gramStart"/>
       <w:r>
         <w:rPr>
           <w:b/>
           <w:bCs/>
         </w:rPr>
-        <w:t>2.0 inch</w:t>
-      </w:r>
-      <w:proofErr w:type="gramEnd"/>
-      <w:r>
-        <w:rPr>
-          <w:b/>
-          <w:bCs/>
-        </w:rPr>
-        <w:t xml:space="preserve"> touch display module</w:t>
+        <w:t>2.0 inch touch display module</w:t>
       </w:r>
     </w:p>
     <w:p>
@@ -58,15 +49,7 @@
         </w:numPr>
       </w:pPr>
       <w:r>
-        <w:t xml:space="preserve">Model </w:t>
-      </w:r>
-      <w:proofErr w:type="gramStart"/>
-      <w:r>
-        <w:t>Name :</w:t>
-      </w:r>
-      <w:proofErr w:type="gramEnd"/>
-      <w:r>
-        <w:t> D200C2409V0</w:t>
+        <w:t>Model Name : D200C2409V0</w:t>
       </w:r>
     </w:p>
     <w:p>
@@ -77,15 +60,7 @@
         </w:numPr>
       </w:pPr>
       <w:r>
-        <w:t xml:space="preserve">Screen </w:t>
-      </w:r>
-      <w:proofErr w:type="gramStart"/>
-      <w:r>
-        <w:t>size :</w:t>
-      </w:r>
-      <w:proofErr w:type="gramEnd"/>
-      <w:r>
-        <w:t xml:space="preserve"> 2.0 inch</w:t>
+        <w:t>Screen size : 2.0 inch</w:t>
       </w:r>
     </w:p>
     <w:p>
@@ -95,13 +70,8 @@
           <w:numId w:val="1"/>
         </w:numPr>
       </w:pPr>
-      <w:proofErr w:type="gramStart"/>
-      <w:r>
-        <w:t>Resolution :</w:t>
-      </w:r>
-      <w:proofErr w:type="gramEnd"/>
-      <w:r>
-        <w:t xml:space="preserve"> 480*640</w:t>
+      <w:r>
+        <w:t>Resolution : 480*640</w:t>
       </w:r>
     </w:p>
     <w:p>
@@ -123,15 +93,7 @@
         </w:numPr>
       </w:pPr>
       <w:r>
-        <w:t>Active area(mm</w:t>
-      </w:r>
-      <w:proofErr w:type="gramStart"/>
-      <w:r>
-        <w:t>) :</w:t>
-      </w:r>
-      <w:proofErr w:type="gramEnd"/>
-      <w:r>
-        <w:t xml:space="preserve"> 30.6 (W)*40.8 (H)</w:t>
+        <w:t>Active area(mm) : 30.6 (W)*40.8 (H)</w:t>
       </w:r>
     </w:p>
     <w:p>
@@ -142,15 +104,7 @@
         </w:numPr>
       </w:pPr>
       <w:r>
-        <w:t xml:space="preserve">LCD Interface </w:t>
-      </w:r>
-      <w:proofErr w:type="gramStart"/>
-      <w:r>
-        <w:t>Type :</w:t>
-      </w:r>
-      <w:proofErr w:type="gramEnd"/>
-      <w:r>
-        <w:t xml:space="preserve"> MIPI and RGB565</w:t>
+        <w:t>LCD Interface Type : MIPI and RGB565</w:t>
       </w:r>
     </w:p>
     <w:p>
@@ -161,15 +115,7 @@
         </w:numPr>
       </w:pPr>
       <w:r>
-        <w:t xml:space="preserve">LCD </w:t>
-      </w:r>
-      <w:proofErr w:type="gramStart"/>
-      <w:r>
-        <w:t>Driver :</w:t>
-      </w:r>
-      <w:proofErr w:type="gramEnd"/>
-      <w:r>
-        <w:t xml:space="preserve"> ST7701S</w:t>
+        <w:t>LCD Driver : ST7701S</w:t>
       </w:r>
     </w:p>
     <w:p>
@@ -179,21 +125,8 @@
           <w:numId w:val="1"/>
         </w:numPr>
       </w:pPr>
-      <w:proofErr w:type="gramStart"/>
-      <w:r>
-        <w:t>Touch :</w:t>
-      </w:r>
-      <w:proofErr w:type="gramEnd"/>
-      <w:r>
-        <w:t xml:space="preserve"> </w:t>
-      </w:r>
-      <w:proofErr w:type="spellStart"/>
-      <w:r>
-        <w:t>apacitive</w:t>
-      </w:r>
-      <w:proofErr w:type="spellEnd"/>
-      <w:r>
-        <w:t xml:space="preserve"> touch screen</w:t>
+      <w:r>
+        <w:t>Touch : apacitive touch screen</w:t>
       </w:r>
     </w:p>
     <w:p>
@@ -204,15 +137,7 @@
         </w:numPr>
       </w:pPr>
       <w:r>
-        <w:t xml:space="preserve">Touch Interface </w:t>
-      </w:r>
-      <w:proofErr w:type="gramStart"/>
-      <w:r>
-        <w:t>Type :</w:t>
-      </w:r>
-      <w:proofErr w:type="gramEnd"/>
-      <w:r>
-        <w:t xml:space="preserve"> I2C</w:t>
+        <w:t>Touch Interface Type : I2C</w:t>
       </w:r>
     </w:p>
     <w:p>
@@ -223,15 +148,7 @@
         </w:numPr>
       </w:pPr>
       <w:r>
-        <w:t xml:space="preserve">Touch </w:t>
-      </w:r>
-      <w:proofErr w:type="gramStart"/>
-      <w:r>
-        <w:t>Driver :</w:t>
-      </w:r>
-      <w:proofErr w:type="gramEnd"/>
-      <w:r>
-        <w:t xml:space="preserve"> FT6336</w:t>
+        <w:t>Touch Driver : FT6336</w:t>
       </w:r>
     </w:p>
     <w:p>
@@ -241,21 +158,8 @@
           <w:numId w:val="1"/>
         </w:numPr>
       </w:pPr>
-      <w:proofErr w:type="gramStart"/>
-      <w:r>
-        <w:t>Brightness :</w:t>
-      </w:r>
-      <w:proofErr w:type="gramEnd"/>
-      <w:r>
-        <w:t xml:space="preserve"> </w:t>
-      </w:r>
-      <w:proofErr w:type="gramStart"/>
-      <w:r>
-        <w:t>400  Cd</w:t>
-      </w:r>
-      <w:proofErr w:type="gramEnd"/>
-      <w:r>
-        <w:t>/m²</w:t>
+      <w:r>
+        <w:t>Brightness : 400  Cd/m²</w:t>
       </w:r>
     </w:p>
     <w:p>
@@ -266,15 +170,7 @@
         </w:numPr>
       </w:pPr>
       <w:r>
-        <w:t xml:space="preserve">Display </w:t>
-      </w:r>
-      <w:proofErr w:type="gramStart"/>
-      <w:r>
-        <w:t>type :</w:t>
-      </w:r>
-      <w:proofErr w:type="gramEnd"/>
-      <w:r>
-        <w:t xml:space="preserve"> IPS</w:t>
+        <w:t>Display type : IPS</w:t>
       </w:r>
     </w:p>
     <w:p>
@@ -453,6 +349,129 @@
     </w:p>
     <w:p/>
     <w:p/>
+    <w:p/>
+    <w:p/>
+    <w:p>
+      <w:r>
+        <w:rPr>
+          <w:rFonts w:hint="eastAsia"/>
+        </w:rPr>
+        <w:lastRenderedPageBreak/>
+        <w:t>V2 Camera</w:t>
+      </w:r>
+    </w:p>
+    <w:p>
+      <w:pPr>
+        <w:rPr>
+          <w:rFonts w:hint="eastAsia"/>
+        </w:rPr>
+      </w:pPr>
+    </w:p>
+    <w:p>
+      <w:hyperlink r:id="rId8" w:history="1">
+        <w:r>
+          <w:rPr>
+            <w:rStyle w:val="Hyperlink"/>
+          </w:rPr>
+          <w:t>https://www.raspberrypi.com/documentation/accessories/camera.html#camera-module-2</w:t>
+        </w:r>
+      </w:hyperlink>
+    </w:p>
+    <w:p/>
+    <w:p>
+      <w:r>
+        <w:rPr>
+          <w:noProof/>
+        </w:rPr>
+        <w:drawing>
+          <wp:inline distT="0" distB="0" distL="0" distR="0" wp14:anchorId="26EDB137" wp14:editId="55B79FB9">
+            <wp:extent cx="5943600" cy="5394325"/>
+            <wp:effectExtent l="0" t="0" r="0" b="0"/>
+            <wp:docPr id="778870889" name="Picture 1"/>
+            <wp:cNvGraphicFramePr>
+              <a:graphicFrameLocks xmlns:a="http://schemas.openxmlformats.org/drawingml/2006/main" noChangeAspect="1"/>
+            </wp:cNvGraphicFramePr>
+            <a:graphic xmlns:a="http://schemas.openxmlformats.org/drawingml/2006/main">
+              <a:graphicData uri="http://schemas.openxmlformats.org/drawingml/2006/picture">
+                <pic:pic xmlns:pic="http://schemas.openxmlformats.org/drawingml/2006/picture">
+                  <pic:nvPicPr>
+                    <pic:cNvPr id="778870889" name=""/>
+                    <pic:cNvPicPr/>
+                  </pic:nvPicPr>
+                  <pic:blipFill>
+                    <a:blip r:embed="rId9"/>
+                    <a:stretch>
+                      <a:fillRect/>
+                    </a:stretch>
+                  </pic:blipFill>
+                  <pic:spPr>
+                    <a:xfrm>
+                      <a:off x="0" y="0"/>
+                      <a:ext cx="5943600" cy="5394325"/>
+                    </a:xfrm>
+                    <a:prstGeom prst="rect">
+                      <a:avLst/>
+                    </a:prstGeom>
+                  </pic:spPr>
+                </pic:pic>
+              </a:graphicData>
+            </a:graphic>
+          </wp:inline>
+        </w:drawing>
+      </w:r>
+    </w:p>
+    <w:p/>
+    <w:p/>
+    <w:p/>
+    <w:p/>
+    <w:p/>
+    <w:p>
+      <w:r>
+        <w:t>https://blog.arducam.com/raspberry-pi-camera-pinout/</w:t>
+      </w:r>
+    </w:p>
+    <w:p>
+      <w:r>
+        <w:rPr>
+          <w:noProof/>
+        </w:rPr>
+        <w:drawing>
+          <wp:inline distT="0" distB="0" distL="0" distR="0" wp14:anchorId="6EC66830" wp14:editId="2536EDE9">
+            <wp:extent cx="5943600" cy="4091940"/>
+            <wp:effectExtent l="0" t="0" r="0" b="3810"/>
+            <wp:docPr id="1549945262" name="Picture 1"/>
+            <wp:cNvGraphicFramePr>
+              <a:graphicFrameLocks xmlns:a="http://schemas.openxmlformats.org/drawingml/2006/main" noChangeAspect="1"/>
+            </wp:cNvGraphicFramePr>
+            <a:graphic xmlns:a="http://schemas.openxmlformats.org/drawingml/2006/main">
+              <a:graphicData uri="http://schemas.openxmlformats.org/drawingml/2006/picture">
+                <pic:pic xmlns:pic="http://schemas.openxmlformats.org/drawingml/2006/picture">
+                  <pic:nvPicPr>
+                    <pic:cNvPr id="1549945262" name=""/>
+                    <pic:cNvPicPr/>
+                  </pic:nvPicPr>
+                  <pic:blipFill>
+                    <a:blip r:embed="rId10"/>
+                    <a:stretch>
+                      <a:fillRect/>
+                    </a:stretch>
+                  </pic:blipFill>
+                  <pic:spPr>
+                    <a:xfrm>
+                      <a:off x="0" y="0"/>
+                      <a:ext cx="5943600" cy="4091940"/>
+                    </a:xfrm>
+                    <a:prstGeom prst="rect">
+                      <a:avLst/>
+                    </a:prstGeom>
+                  </pic:spPr>
+                </pic:pic>
+              </a:graphicData>
+            </a:graphic>
+          </wp:inline>
+        </w:drawing>
+      </w:r>
+    </w:p>
     <w:sectPr>
       <w:pgSz w:w="12240" w:h="15840"/>
       <w:pgMar w:top="1701" w:right="1440" w:bottom="1440" w:left="1440" w:header="720" w:footer="720" w:gutter="0"/>
@@ -1223,6 +1242,7 @@
   <w:style w:type="character" w:default="1" w:styleId="DefaultParagraphFont">
     <w:name w:val="Default Paragraph Font"/>
     <w:uiPriority w:val="1"/>
+    <w:semiHidden/>
     <w:unhideWhenUsed/>
   </w:style>
   <w:style w:type="table" w:default="1" w:styleId="TableNormal">
@@ -1534,6 +1554,29 @@
       <w:smallCaps/>
       <w:color w:val="2F5496" w:themeColor="accent1" w:themeShade="BF"/>
       <w:spacing w:val="5"/>
+    </w:rPr>
+  </w:style>
+  <w:style w:type="character" w:styleId="Hyperlink">
+    <w:name w:val="Hyperlink"/>
+    <w:basedOn w:val="DefaultParagraphFont"/>
+    <w:uiPriority w:val="99"/>
+    <w:unhideWhenUsed/>
+    <w:rsid w:val="00337766"/>
+    <w:rPr>
+      <w:color w:val="0563C1" w:themeColor="hyperlink"/>
+      <w:u w:val="single"/>
+    </w:rPr>
+  </w:style>
+  <w:style w:type="character" w:styleId="UnresolvedMention">
+    <w:name w:val="Unresolved Mention"/>
+    <w:basedOn w:val="DefaultParagraphFont"/>
+    <w:uiPriority w:val="99"/>
+    <w:semiHidden/>
+    <w:unhideWhenUsed/>
+    <w:rsid w:val="00337766"/>
+    <w:rPr>
+      <w:color w:val="605E5C"/>
+      <w:shd w:val="clear" w:color="auto" w:fill="E1DFDD"/>
     </w:rPr>
   </w:style>
 </w:styles>

</xml_diff>